<commit_message>
chore: remove snapshot preview from repository and docs
</commit_message>
<xml_diff>
--- a/docs/FaceCard_Project_Report.docx
+++ b/docs/FaceCard_Project_Report.docx
@@ -5632,84 +5632,6 @@
     <w:p>
       <w:pPr>
         <w:keepNext/>
-        <w:spacing w:before="280" w:after="80"/>
-      </w:pPr>
-      <w:r>
-        <w:rPr>
-          <w:rFonts w:ascii="Segoe UI Semibold" w:hAnsi="Segoe UI Semibold"/>
-          <w:b/>
-          <w:color w:val="0D9488"/>
-          <w:sz w:val="26"/>
-        </w:rPr>
-        <w:t>4.1 Visual Verification &amp; Real-Time Output Demonstration</w:t>
-      </w:r>
-    </w:p>
-    <w:p>
-      <w:pPr>
-        <w:spacing w:before="0" w:after="120" w:line="276" w:lineRule="auto"/>
-      </w:pPr>
-      <w:r>
-        <w:rPr>
-          <w:rFonts w:ascii="Segoe UI" w:hAnsi="Segoe UI"/>
-          <w:color w:val="334155"/>
-          <w:sz w:val="20"/>
-        </w:rPr>
-        <w:t>The following high-resolution snapshot illustrates the FaceCard split-screen HUD in active operation, capturing real-time facial tracking, biometric landmark points, multi-criteria skin scoring, demographic estimation, and celebrity look-alike matching:</w:t>
-      </w:r>
-    </w:p>
-    <w:p>
-      <w:r>
-        <w:drawing>
-          <wp:inline xmlns:a="http://schemas.openxmlformats.org/drawingml/2006/main" xmlns:pic="http://schemas.openxmlformats.org/drawingml/2006/picture">
-            <wp:extent cx="5852160" cy="2911990"/>
-            <wp:docPr id="1" name="Picture 1"/>
-            <wp:cNvGraphicFramePr>
-              <a:graphicFrameLocks noChangeAspect="1"/>
-            </wp:cNvGraphicFramePr>
-            <a:graphic>
-              <a:graphicData uri="http://schemas.openxmlformats.org/drawingml/2006/picture">
-                <pic:pic>
-                  <pic:nvPicPr>
-                    <pic:cNvPr id="0" name="skin_celeb_eval_20261010_194651.jpg"/>
-                    <pic:cNvPicPr/>
-                  </pic:nvPicPr>
-                  <pic:blipFill>
-                    <a:blip r:embed="rId11"/>
-                    <a:stretch>
-                      <a:fillRect/>
-                    </a:stretch>
-                  </pic:blipFill>
-                  <pic:spPr>
-                    <a:xfrm>
-                      <a:off x="0" y="0"/>
-                      <a:ext cx="5852160" cy="2911990"/>
-                    </a:xfrm>
-                    <a:prstGeom prst="rect"/>
-                  </pic:spPr>
-                </pic:pic>
-              </a:graphicData>
-            </a:graphic>
-          </wp:inline>
-        </w:drawing>
-      </w:r>
-    </w:p>
-    <w:p>
-      <w:pPr>
-        <w:jc w:val="center"/>
-      </w:pPr>
-      <w:r>
-        <w:rPr>
-          <w:rFonts w:ascii="Segoe UI" w:hAnsi="Segoe UI"/>
-          <w:i/>
-          <w:color w:val="64748B"/>
-          <w:sz w:val="17"/>
-        </w:rPr>
-        <w:t>Figure 1: FaceCard Live Execution Dashboard (1246 x 620 px) showing Angelina Jolie Look-Alike Match (7.0/10), Landmark Brackets, Age/Gender Estimation (~20 yrs, Female 55%), and Skin Quality Metrics.</w:t>
-      </w:r>
-    </w:p>
-    <w:p>
-      <w:pPr>
-        <w:keepNext/>
         <w:spacing w:before="360" w:after="120"/>
       </w:pPr>
       <w:r>

</xml_diff>

<commit_message>
Upgrade to 128-D SFace deep embeddings, expand 189-celebrity gallery, add training pipeline, and update docs
</commit_message>
<xml_diff>
--- a/docs/FaceCard_Project_Report.docx
+++ b/docs/FaceCard_Project_Report.docx
@@ -613,6 +613,7 @@
               </w:rPr>
               <w:t>📌 Executive Abstract</w:t>
               <w:br/>
+              <w:t>FaceCard is an end-to-end Deep Learning and Computer Vision mirror system that captures real-time video, localizes 5 facial landmarks via YuNet CNN, performs 5-point affine face alignment, executes ITA°-calibrated and glare-invariant skin quality analysis out of 10, estimates facial age from biometric wrinkle gradients, and matches the user against an expanded gallery of 189 global and Indian film stars, influencers, YouTubers, and athletes using hybrid 128-D SFace deep embeddings and 12 anthropometric proportions.</w:t>
             </w:r>
             <w:r>
               <w:rPr>
@@ -620,7 +621,6 @@
                 <w:color w:val="334155"/>
                 <w:sz w:val="19"/>
               </w:rPr>
-              <w:t>FaceCard is an end-to-end computer vision mirror system that captures real-time video, identifies facial landmarks via deep convolutional networks, executes multi-spectral skin quality analysis (scoring texture, blemishes, and tone uniformity out of 10), infers biological age and gender demographics, and maps the user's craniofacial geometry to an indexed gallery of 120 verified cultural and entertainment icons with calibrated similarity scoring.</w:t>
             </w:r>
           </w:p>
         </w:tc>
@@ -709,7 +709,7 @@
           <w:color w:val="1E293B"/>
           <w:sz w:val="20"/>
         </w:rPr>
-        <w:t xml:space="preserve">• Non-Invasive Skin Quality Quantification: </w:t>
+        <w:t>• ITA°-Calibrated &amp; Glare-Invariant Skin Quantification: Formulate a multi-spectral skin health metric out of 10 using specular glare exclusion, Individual Typology Angle (ITA°) melanin-adaptive Black-Hat dark spot extraction, CIELAB erythema variance, and illumination-normalized YCrCb chrominance uniformity.</w:t>
       </w:r>
       <w:r>
         <w:rPr>
@@ -717,7 +717,6 @@
           <w:color w:val="334155"/>
           <w:sz w:val="20"/>
         </w:rPr>
-        <w:t>Formulate a quantitative, multi-spectral skin health evaluation metric out of 10 based on high-frequency bilateral filtering residuals, morphological Black-Hat dark spot extraction, CIELAB erythema (redness) variance, and YCrCb chrominance uniformity.</w:t>
       </w:r>
     </w:p>
     <w:p>
@@ -778,7 +777,7 @@
           <w:color w:val="1E293B"/>
           <w:sz w:val="20"/>
         </w:rPr>
-        <w:t xml:space="preserve">• 12-Dimensional Anthropometric Celebrity Matching: </w:t>
+        <w:t>• Hybrid 128-D SFace Deep Embeddings &amp; 12-D Anthropometric Matching: Combine 5-point affine-aligned 128-dimensional SFace deep identity embeddings (face_recognition_sface_2021dec.onnx) and a learned 128x128 discriminative whitening projection (calibrated_models.npz) with 12 craniofacial geometric ratios across an expanded gallery of 189 verified celebrities, influencers, and athletes.</w:t>
       </w:r>
       <w:r>
         <w:rPr>
@@ -786,7 +785,6 @@
           <w:color w:val="334155"/>
           <w:sz w:val="20"/>
         </w:rPr>
-        <w:t>Build a 12-dimensional craniofacial proportional feature vector comparing the user's geometric ratios against 120 verified figures across 5 categories, outputting explainable similarity scores calibrated around realistic tolerances (~7.0 - 7.6 / 10).</w:t>
       </w:r>
     </w:p>
     <w:p>
@@ -2672,7 +2670,7 @@
           <w:color w:val="0D9488"/>
           <w:sz w:val="26"/>
         </w:rPr>
-        <w:t>3.4 Stage 6: 12-Dimensional Anthropometric Celebrity Look-Alike Matcher</w:t>
+        <w:t>3.4 Stage 6: Hybrid 128-D SFace Deep Embedding &amp; 12-D Anthropometric Celebrity Matcher</w:t>
       </w:r>
     </w:p>
     <w:p>
@@ -2685,7 +2683,7 @@
           <w:color w:val="334155"/>
           <w:sz w:val="20"/>
         </w:rPr>
-        <w:t>Unlike gimmicky look-alike applications that assign random percentages or rely on black-box embeddings, FaceCard extracts a true 12-dimensional geometric anthropometric feature vector from the 5 deep learning landmarks:</w:t>
+        <w:t>To achieve both high-precision facial identity recognition and explainable biometric feedback, FaceCard combines 5-point similarity affine face alignment (112x112 canonical warp via cv2.estimateAffinePartial2D), 128-dimensional SFace deep neural embeddings (face_recognition_sface_2021dec.onnx), a locally trained 128x128 Discriminative Metric Whitening Matrix (train_models.py), and 12 geometric anthropometric proportions extracted from the 5 deep learning landmarks:</w:t>
       </w:r>
     </w:p>
     <w:tbl>
@@ -4374,7 +4372,7 @@
           <w:color w:val="334155"/>
           <w:sz w:val="20"/>
         </w:rPr>
-        <w:t>FaceCard maintains a verified index (`celebrity_gallery/index.npz`) of 120 celebrities across five categories: Hollywood Film Stars, Pop &amp; Music Cultural Icons, Top YouTube Creators (MrBeast, PewDiePie, MKBHD, Markiplier), Global Influencers, and World Champion Athletes. Each candidate holds a precomputed 12-dimensional feature card and center-cropped HD reference portrait.</w:t>
+        <w:t>FaceCard maintains an expanded verified index (celebrity_gallery/index.npz) of 189 personalities (181 face-verified portraits + curated profiles) across Film Stars/Actors (Shah Rukh Khan, Hrithik Roshan, Ranbir Kapoor, Allu Arjun, Prabhas, Deepika Padukone, Alia Bhatt, Rashmika Mandanna, Kriti Sanon, Shraddha Kapoor, Leonardo DiCaprio, Keanu Reeves, Zendaya, etc.), YouTubers &amp; Digital Influencers (CarryMinati, Bhuvan Bam, Prajakta Koli, Kusha Kapila, Ashish Chanchlani, Dhruv Rathee, Samay Raina, Zakir Khan, MrBeast, PewDiePie, MKBHD, etc.), Music Icons (Diljit Dosanjh, Arijit Singh, Shreya Ghoshal, A. R. Rahman, Taylor Swift, Billie Eilish, etc.), and World-Champion Athletes (Virat Kohli, MS Dhoni, Rohit Sharma, Sachin Tendulkar, Neeraj Chopra, P. V. Sindhu, LeBron James, etc.). Each candidate holds a precomputed 128-D SFace embedding, 12-D biometric feature card, and HD reference portrait.</w:t>
       </w:r>
     </w:p>
     <w:tbl>
@@ -4416,8 +4414,25 @@
                 <w:color w:val="1E3A8A"/>
                 <w:sz w:val="21"/>
               </w:rPr>
-              <w:t>📌 Mathematical Formulation: Calibrated Anthropometric Similarity</w:t>
+              <w:t>📌 Mathematical Formulation: Hybrid 128-D SFace + 12-D Anthropometric Similarity</w:t>
               <w:br/>
+              <w:t>1. 5-Point Similarity Alignment: Warps detected keypoints to canonical 112x112 coordinates via cv2.estimateAffinePartial2D.</w:t>
+              <w:br/>
+              <w:t>2. Calibrated 128-D Deep Cosine Similarity:</w:t>
+              <w:br/>
+              <w:t xml:space="preserve">   e_calib = (e - μ_emb) · W_proj / ||(e - μ_emb) · W_proj||</w:t>
+              <w:br/>
+              <w:t xml:space="preserve">   Sim_deep = 0.65 · (e_q · e_r) + 0.35 · (e_q,calib · e_r,calib)</w:t>
+              <w:br/>
+              <w:t>3. Fisher-Weighted 12-Trait Biometric Score:</w:t>
+              <w:br/>
+              <w:t xml:space="preserve">   CheckScore_k = Clip(100.0 · (1.0 - |q_k - r_{i,k}| / T_k), 18.0, 99.0)</w:t>
+              <w:br/>
+              <w:t xml:space="preserve">   GeomComposite = 0.75 · WeightedAvg(CheckScore_k, w_Fisher) + 0.25 · (CosineSim_12D · 100.0)</w:t>
+              <w:br/>
+              <w:t>4. Hybrid Composite Score = 0.68 · Scale(Sim_deep) + 0.32 · GeomComposite</w:t>
+              <w:br/>
+              <w:t xml:space="preserve">   Produces responsive, calibrated look-alike scores from 6.8 to 9.8 / 10.</w:t>
             </w:r>
             <w:r>
               <w:rPr>
@@ -4425,21 +4440,6 @@
                 <w:color w:val="334155"/>
                 <w:sz w:val="19"/>
               </w:rPr>
-              <w:t>Composite Match Scoring Mathematics:</w:t>
-              <w:br/>
-              <w:t>For candidate i and trait k with tolerance T_k:</w:t>
-              <w:br/>
-              <w:t>CheckScore_k = Clip(100.0 · (1.0 - |q_k - r_{i,k}| / T_k), 15.0, 99.0)</w:t>
-              <w:br/>
-              <w:t>TraitAverage = WeightedAverage(CheckScore_k, Weights_k)</w:t>
-              <w:br/>
-              <w:t>CosineSim = (q · r_i) / (||q|| · ||r_i||)</w:t>
-              <w:br/>
-              <w:t>Composite = 0.75 · TraitAverage + 0.25 · (CosineSim · 100.0)</w:t>
-              <w:br/>
-              <w:t>Calibrated Final Score (/10) = 6.8 + ((Composite - 50.0) / 45.0) · 0.8</w:t>
-              <w:br/>
-              <w:t>Produces calibrated realistic human look-alike scores between 7.0 and 7.6 / 10.</w:t>
             </w:r>
           </w:p>
         </w:tc>
@@ -4582,7 +4582,7 @@
           <w:color w:val="1E3A8A"/>
           <w:sz w:val="32"/>
         </w:rPr>
-        <w:t>4. What All Was Achieved (Key Achievements)</w:t>
+        <w:t>4. Model Training Architecture, Datasets &amp; Key Achievements</w:t>
       </w:r>
     </w:p>
     <w:p>
@@ -4595,7 +4595,7 @@
           <w:color w:val="334155"/>
           <w:sz w:val="20"/>
         </w:rPr>
-        <w:t>The current iteration of FaceCard represents a comprehensive architectural overhaul, evolving from an experimental prototype into an enterprise-grade biometric evaluation platform:</w:t>
+        <w:t>FaceCard utilizes a two-stage training architecture: (1) Foundational Pre-Trained Backbones—YuNet CNN trained on WIDER FACE (32,203 images, 393,703 faces with 5 landmarks using CIoU + Wing loss), SFace 128-D recognizer trained on MS-Celeb-1M / WebFace (~5.8M aligned 112x112 images across ~85,000 identities using Sigmoid-Constrained Hypersphere Loss), and OpenVINO Age/Gender trained on IMDB-WIKI (500,000+ faces); and (2) Local Domain-Specific Metric Learning &amp; Calibration (train_models.py)—trained on 181 gallery identities x 5 augmented views (905 aligned 112x112 face crops) to learn a 128x128 Within-Class Whitening Projection (99.45% Rank-1 and 100.00% Rank-3 identification accuracy), 12 Fisher Discriminative Trait Weights, and an L2-Regularized IRLS Logistic Gender Probe (93.15% 5-fold CV accuracy) saved in models/calibrated_models.npz.</w:t>
       </w:r>
     </w:p>
     <w:tbl>
@@ -4957,7 +4957,7 @@
                 <w:color w:val="334155"/>
                 <w:sz w:val="18"/>
               </w:rPr>
-              <w:t>120 verified figures across 5 categories indexed in index.npz with real portraits</w:t>
+              <w:t>189 verified figures (181 portrait-indexed in index.npz + curated creators) including 79 Indian actors, influencers, YouTubers &amp; athletes</w:t>
             </w:r>
           </w:p>
         </w:tc>
@@ -4988,7 +4988,7 @@
                 <w:color w:val="334155"/>
                 <w:sz w:val="18"/>
               </w:rPr>
-              <w:t>480% database expansion; authentic HD center-cropped reference portraits</w:t>
+              <w:t>750%+ database expansion; includes Bollywood/Pan-India stars, Indian YouTubers &amp; Cricket icons</w:t>
             </w:r>
           </w:p>
         </w:tc>
@@ -5083,7 +5083,7 @@
                 <w:color w:val="334155"/>
                 <w:sz w:val="18"/>
               </w:rPr>
-              <w:t>True 12-dimensional anthropometric craniofacial geometric proportions</w:t>
+              <w:t>Hybrid 128-D SFace Deep Embeddings (MS-Celeb-1M) + 128x128 Metric Whitening (train_models.py) + 12 Fisher-weighted traits</w:t>
             </w:r>
           </w:p>
         </w:tc>
@@ -5114,7 +5114,7 @@
                 <w:color w:val="334155"/>
                 <w:sz w:val="18"/>
               </w:rPr>
-              <w:t>Calibrated realistic human scoring (~7.0-7.6/10) with top 3 trait breakdowns</w:t>
+              <w:t>99.45% Rank-1 &amp; 100.00% Rank-3 multi-view identification accuracy with explainable trait breakdowns</w:t>
             </w:r>
           </w:p>
         </w:tc>
@@ -5696,8 +5696,47 @@
                 <w:color w:val="1E3A8A"/>
                 <w:sz w:val="21"/>
               </w:rPr>
-              <w:t>📌 Self-Test Verification Terminal Log</w:t>
+              <w:t>📌 Pre-Launch File Integrity &amp; Self-Test Verification Log (test_system.py)</w:t>
               <w:br/>
+              <w:t>==================================================================</w:t>
+              <w:br/>
+              <w:t xml:space="preserve">  FaceCard: Pre-Launch File Integrity &amp; System Readiness Check</w:t>
+              <w:br/>
+              <w:t>==================================================================</w:t>
+              <w:br/>
+              <w:t>✓ [PASS] File Integrity Verified: All 9 core modules, ONNX models, and gallery indexes are intact.</w:t>
+              <w:br/>
+              <w:t>✓ [PASS] All Python modules imported successfully.</w:t>
+              <w:br/>
+              <w:t>[FaceDetector] Loaded Deep Learning YuNet DNN (models/face_detection_yunet_2023mar.onnx)</w:t>
+              <w:br/>
+              <w:t>✓ [PASS] Robust Face Detector initialized (Backend: yunet)</w:t>
+              <w:br/>
+              <w:t>✓ [PASS] SFace 128-D Deep Recognizer available: True</w:t>
+              <w:br/>
+              <w:t>[CelebrityMatcher] Loaded trained metric calibration (models/calibrated_models.npz)</w:t>
+              <w:br/>
+              <w:t>[CelebrityMatcher] Loaded 181 verified celebrities (181 with 128-D SFace embeddings) from celebrity_gallery/index.npz</w:t>
+              <w:br/>
+              <w:t>✓ [PASS] AI engines initialized (189 total celebrities ready).</w:t>
+              <w:br/>
+              <w:t>✓ [PASS] Dashboard rendered successfully: 1246x620 px, 3 channels.</w:t>
+              <w:br/>
+              <w:t>✓ [PASS] Top Match: Bruce Lee [ACTOR] (Score: 7.8/10)</w:t>
+              <w:br/>
+              <w:t xml:space="preserve">         Biometric traits: [('Nose Height', 94), ('Texture Profile', 92), ('Complexion Undertone', 89)]</w:t>
+              <w:br/>
+              <w:t>✓ [PASS] Manual cycle works: Bruce Lee -&gt; Bruce Springsteen</w:t>
+              <w:br/>
+              <w:t>✓ [PASS] Age &amp; Demographics: ~20 yrs (Youthful &amp; Fresh)</w:t>
+              <w:br/>
+              <w:t>✓ [PASS] Stress tests passed (black frames, HD feeds, noise feeds handled gracefully).</w:t>
+              <w:br/>
+              <w:t>==================================================================</w:t>
+              <w:br/>
+              <w:t xml:space="preserve">  🎉 ALL FILES INTACT &amp; READY TO USE! You can now launch Option 1.</w:t>
+              <w:br/>
+              <w:t>==================================================================</w:t>
             </w:r>
             <w:r>
               <w:rPr>
@@ -5705,41 +5744,6 @@
                 <w:color w:val="334155"/>
                 <w:sz w:val="19"/>
               </w:rPr>
-              <w:t>==================================================================</w:t>
-              <w:br/>
-              <w:t xml:space="preserve">  Running AI Biometric Skin &amp; Celebrity Matcher Self-Test         </w:t>
-              <w:br/>
-              <w:t>==================================================================</w:t>
-              <w:br/>
-              <w:t>✓ [PASS] All modules imported successfully.</w:t>
-              <w:br/>
-              <w:t>[FaceDetector] Loaded Deep Learning YuNet DNN (models/face_detection_yunet_2023mar.onnx)</w:t>
-              <w:br/>
-              <w:t>✓ [PASS] Robust Face Detector initialized (Backend: yunet)</w:t>
-              <w:br/>
-              <w:t>[AgeEstimator] Loaded Deep Learning Age Model (models/age-gender-recognition-retail-0013.onnx)</w:t>
-              <w:br/>
-              <w:t>[CelebrityMatcher] Loaded 120 verified celebrities from gallery index (celebrity_gallery/index.npz)</w:t>
-              <w:br/>
-              <w:t>✓ [PASS] AI engines initialized.</w:t>
-              <w:br/>
-              <w:t>✓ [PASS] Dashboard rendered successfully: 1246x620 px, 3 channels.</w:t>
-              <w:br/>
-              <w:t>✓ [PASS] Top Match: Angelina Jolie [HOLLYWOOD] (Score: 7.0/10)</w:t>
-              <w:br/>
-              <w:t xml:space="preserve">         Biometric traits: [('Philtrum Gap', 93), ('Nose Height', 91), ('Eye Alignment', 86)]</w:t>
-              <w:br/>
-              <w:t>✓ [PASS] Manual cycle works: Angelina Jolie -&gt; Anne Hathaway</w:t>
-              <w:br/>
-              <w:t>✓ [PASS] Age &amp; Demographics: ~20 yrs (Female, 55% conf)</w:t>
-              <w:br/>
-              <w:t>✓ [PASS] Stress tests passed (black frames, HD feeds, noise feeds handled gracefully).</w:t>
-              <w:br/>
-              <w:t>==================================================================</w:t>
-              <w:br/>
-              <w:t xml:space="preserve">  🎉 ALL TESTS PASSED! System is completely error-free.           </w:t>
-              <w:br/>
-              <w:t>==================================================================</w:t>
             </w:r>
           </w:p>
         </w:tc>

</xml_diff>